<commit_message>
Práctica 9. Consultas avanzadas sakila BDR-P1-P09
Compañero de trabajo Ian Robles Salazar
</commit_message>
<xml_diff>
--- a/ConsultasSQL.docx
+++ b/ConsultasSQL.docx
@@ -9,8 +9,14 @@
           <w:ilvl w:val="0"/>
           <w:numId w:val="1"/>
         </w:numPr>
-      </w:pPr>
-      <w:r>
+        <w:rPr>
+          <w:b/>
+        </w:rPr>
+      </w:pPr>
+      <w:r>
+        <w:rPr>
+          <w:b/>
+        </w:rPr>
         <w:t>Mostrar los actores y las películas en las que participan</w:t>
       </w:r>
     </w:p>
@@ -71,8 +77,6 @@
       <w:r>
         <w:t xml:space="preserve"> f</w:t>
       </w:r>
-      <w:bookmarkStart w:id="0" w:name="_GoBack"/>
-      <w:bookmarkEnd w:id="0"/>
       <w:r>
         <w:t xml:space="preserve"> ON </w:t>
       </w:r>
@@ -117,6 +121,52 @@
       <w:proofErr w:type="spellEnd"/>
       <w:r>
         <w:t>;</w:t>
+      </w:r>
+    </w:p>
+    <w:p>
+      <w:pPr>
+        <w:pStyle w:val="Prrafodelista"/>
+      </w:pPr>
+      <w:r>
+        <w:rPr>
+          <w:noProof/>
+          <w:lang w:eastAsia="es-MX"/>
+        </w:rPr>
+        <w:drawing>
+          <wp:inline distT="0" distB="0" distL="0" distR="0" wp14:anchorId="02F18291" wp14:editId="0A40B518">
+            <wp:extent cx="2781300" cy="1769232"/>
+            <wp:effectExtent l="0" t="0" r="0" b="2540"/>
+            <wp:docPr id="1" name="Imagen 1"/>
+            <wp:cNvGraphicFramePr>
+              <a:graphicFrameLocks xmlns:a="http://schemas.openxmlformats.org/drawingml/2006/main" noChangeAspect="1"/>
+            </wp:cNvGraphicFramePr>
+            <a:graphic xmlns:a="http://schemas.openxmlformats.org/drawingml/2006/main">
+              <a:graphicData uri="http://schemas.openxmlformats.org/drawingml/2006/picture">
+                <pic:pic xmlns:pic="http://schemas.openxmlformats.org/drawingml/2006/picture">
+                  <pic:nvPicPr>
+                    <pic:cNvPr id="1" name=""/>
+                    <pic:cNvPicPr/>
+                  </pic:nvPicPr>
+                  <pic:blipFill>
+                    <a:blip r:embed="rId6"/>
+                    <a:stretch>
+                      <a:fillRect/>
+                    </a:stretch>
+                  </pic:blipFill>
+                  <pic:spPr>
+                    <a:xfrm>
+                      <a:off x="0" y="0"/>
+                      <a:ext cx="2789579" cy="1774498"/>
+                    </a:xfrm>
+                    <a:prstGeom prst="rect">
+                      <a:avLst/>
+                    </a:prstGeom>
+                  </pic:spPr>
+                </pic:pic>
+              </a:graphicData>
+            </a:graphic>
+          </wp:inline>
+        </w:drawing>
       </w:r>
     </w:p>
     <w:p>
@@ -131,8 +181,14 @@
           <w:ilvl w:val="0"/>
           <w:numId w:val="1"/>
         </w:numPr>
-      </w:pPr>
-      <w:r>
+        <w:rPr>
+          <w:b/>
+        </w:rPr>
+      </w:pPr>
+      <w:r>
+        <w:rPr>
+          <w:b/>
+        </w:rPr>
         <w:t xml:space="preserve">Mostrar las películas ordenadas de mayor a menor duración </w:t>
       </w:r>
     </w:p>
@@ -207,6 +263,52 @@
       <w:proofErr w:type="spellEnd"/>
       <w:r>
         <w:t xml:space="preserve"> DESC;</w:t>
+      </w:r>
+    </w:p>
+    <w:p>
+      <w:pPr>
+        <w:pStyle w:val="Prrafodelista"/>
+      </w:pPr>
+      <w:r>
+        <w:rPr>
+          <w:noProof/>
+          <w:lang w:eastAsia="es-MX"/>
+        </w:rPr>
+        <w:drawing>
+          <wp:inline distT="0" distB="0" distL="0" distR="0" wp14:anchorId="74BD9072" wp14:editId="5108D426">
+            <wp:extent cx="2013535" cy="1866900"/>
+            <wp:effectExtent l="0" t="0" r="6350" b="0"/>
+            <wp:docPr id="2" name="Imagen 2"/>
+            <wp:cNvGraphicFramePr>
+              <a:graphicFrameLocks xmlns:a="http://schemas.openxmlformats.org/drawingml/2006/main" noChangeAspect="1"/>
+            </wp:cNvGraphicFramePr>
+            <a:graphic xmlns:a="http://schemas.openxmlformats.org/drawingml/2006/main">
+              <a:graphicData uri="http://schemas.openxmlformats.org/drawingml/2006/picture">
+                <pic:pic xmlns:pic="http://schemas.openxmlformats.org/drawingml/2006/picture">
+                  <pic:nvPicPr>
+                    <pic:cNvPr id="1" name=""/>
+                    <pic:cNvPicPr/>
+                  </pic:nvPicPr>
+                  <pic:blipFill>
+                    <a:blip r:embed="rId7"/>
+                    <a:stretch>
+                      <a:fillRect/>
+                    </a:stretch>
+                  </pic:blipFill>
+                  <pic:spPr>
+                    <a:xfrm>
+                      <a:off x="0" y="0"/>
+                      <a:ext cx="2041730" cy="1893042"/>
+                    </a:xfrm>
+                    <a:prstGeom prst="rect">
+                      <a:avLst/>
+                    </a:prstGeom>
+                  </pic:spPr>
+                </pic:pic>
+              </a:graphicData>
+            </a:graphic>
+          </wp:inline>
+        </w:drawing>
       </w:r>
     </w:p>
     <w:p>
@@ -221,16 +323,28 @@
           <w:ilvl w:val="0"/>
           <w:numId w:val="1"/>
         </w:numPr>
-      </w:pPr>
-      <w:r>
+        <w:rPr>
+          <w:b/>
+        </w:rPr>
+      </w:pPr>
+      <w:r>
+        <w:rPr>
+          <w:b/>
+        </w:rPr>
         <w:t>Mostrar las películas que pertenecen a la categoría “</w:t>
       </w:r>
       <w:proofErr w:type="spellStart"/>
       <w:r>
+        <w:rPr>
+          <w:b/>
+        </w:rPr>
         <w:t>Action</w:t>
       </w:r>
       <w:proofErr w:type="spellEnd"/>
       <w:r>
+        <w:rPr>
+          <w:b/>
+        </w:rPr>
         <w:t>”</w:t>
       </w:r>
     </w:p>
@@ -363,6 +477,52 @@
       <w:proofErr w:type="spellEnd"/>
       <w:r>
         <w:t>';</w:t>
+      </w:r>
+    </w:p>
+    <w:p>
+      <w:pPr>
+        <w:pStyle w:val="Prrafodelista"/>
+      </w:pPr>
+      <w:r>
+        <w:rPr>
+          <w:noProof/>
+          <w:lang w:eastAsia="es-MX"/>
+        </w:rPr>
+        <w:drawing>
+          <wp:inline distT="0" distB="0" distL="0" distR="0" wp14:anchorId="04B9A3A3" wp14:editId="12BBF2C3">
+            <wp:extent cx="3318004" cy="1590675"/>
+            <wp:effectExtent l="0" t="0" r="0" b="0"/>
+            <wp:docPr id="3" name="Imagen 3"/>
+            <wp:cNvGraphicFramePr>
+              <a:graphicFrameLocks xmlns:a="http://schemas.openxmlformats.org/drawingml/2006/main" noChangeAspect="1"/>
+            </wp:cNvGraphicFramePr>
+            <a:graphic xmlns:a="http://schemas.openxmlformats.org/drawingml/2006/main">
+              <a:graphicData uri="http://schemas.openxmlformats.org/drawingml/2006/picture">
+                <pic:pic xmlns:pic="http://schemas.openxmlformats.org/drawingml/2006/picture">
+                  <pic:nvPicPr>
+                    <pic:cNvPr id="1" name=""/>
+                    <pic:cNvPicPr/>
+                  </pic:nvPicPr>
+                  <pic:blipFill>
+                    <a:blip r:embed="rId8"/>
+                    <a:stretch>
+                      <a:fillRect/>
+                    </a:stretch>
+                  </pic:blipFill>
+                  <pic:spPr>
+                    <a:xfrm>
+                      <a:off x="0" y="0"/>
+                      <a:ext cx="3339245" cy="1600858"/>
+                    </a:xfrm>
+                    <a:prstGeom prst="rect">
+                      <a:avLst/>
+                    </a:prstGeom>
+                  </pic:spPr>
+                </pic:pic>
+              </a:graphicData>
+            </a:graphic>
+          </wp:inline>
+        </w:drawing>
       </w:r>
     </w:p>
     <w:p>
@@ -377,8 +537,14 @@
           <w:ilvl w:val="0"/>
           <w:numId w:val="1"/>
         </w:numPr>
-      </w:pPr>
-      <w:r>
+        <w:rPr>
+          <w:b/>
+        </w:rPr>
+      </w:pPr>
+      <w:r>
+        <w:rPr>
+          <w:b/>
+        </w:rPr>
         <w:t>Mostrar los clientes con la cantidad de rentas que ha realizado</w:t>
       </w:r>
     </w:p>
@@ -523,12 +689,64 @@
       <w:pPr>
         <w:pStyle w:val="Prrafodelista"/>
       </w:pPr>
-    </w:p>
-    <w:p>
-      <w:pPr>
-        <w:pStyle w:val="Prrafodelista"/>
-      </w:pPr>
-      <w:r>
+      <w:r>
+        <w:rPr>
+          <w:noProof/>
+          <w:lang w:eastAsia="es-MX"/>
+        </w:rPr>
+        <w:drawing>
+          <wp:inline distT="0" distB="0" distL="0" distR="0" wp14:anchorId="30846D46" wp14:editId="008398F8">
+            <wp:extent cx="3724275" cy="1791343"/>
+            <wp:effectExtent l="0" t="0" r="0" b="0"/>
+            <wp:docPr id="4" name="Imagen 4"/>
+            <wp:cNvGraphicFramePr>
+              <a:graphicFrameLocks xmlns:a="http://schemas.openxmlformats.org/drawingml/2006/main" noChangeAspect="1"/>
+            </wp:cNvGraphicFramePr>
+            <a:graphic xmlns:a="http://schemas.openxmlformats.org/drawingml/2006/main">
+              <a:graphicData uri="http://schemas.openxmlformats.org/drawingml/2006/picture">
+                <pic:pic xmlns:pic="http://schemas.openxmlformats.org/drawingml/2006/picture">
+                  <pic:nvPicPr>
+                    <pic:cNvPr id="1" name=""/>
+                    <pic:cNvPicPr/>
+                  </pic:nvPicPr>
+                  <pic:blipFill>
+                    <a:blip r:embed="rId9"/>
+                    <a:stretch>
+                      <a:fillRect/>
+                    </a:stretch>
+                  </pic:blipFill>
+                  <pic:spPr>
+                    <a:xfrm>
+                      <a:off x="0" y="0"/>
+                      <a:ext cx="3753689" cy="1805491"/>
+                    </a:xfrm>
+                    <a:prstGeom prst="rect">
+                      <a:avLst/>
+                    </a:prstGeom>
+                  </pic:spPr>
+                </pic:pic>
+              </a:graphicData>
+            </a:graphic>
+          </wp:inline>
+        </w:drawing>
+      </w:r>
+    </w:p>
+    <w:p>
+      <w:pPr>
+        <w:pStyle w:val="Prrafodelista"/>
+      </w:pPr>
+    </w:p>
+    <w:p>
+      <w:pPr>
+        <w:pStyle w:val="Prrafodelista"/>
+        <w:rPr>
+          <w:b/>
+        </w:rPr>
+      </w:pPr>
+      <w:r>
+        <w:rPr>
+          <w:b/>
+        </w:rPr>
         <w:t>Mostrar los pagos realizados por cada cliente</w:t>
       </w:r>
     </w:p>
@@ -626,65 +844,1278 @@
       <w:pPr>
         <w:pStyle w:val="Prrafodelista"/>
       </w:pPr>
-    </w:p>
-    <w:p>
-      <w:pPr>
-        <w:pStyle w:val="Prrafodelista"/>
-        <w:numPr>
-          <w:ilvl w:val="0"/>
-          <w:numId w:val="1"/>
-        </w:numPr>
-      </w:pPr>
-      <w:r>
+      <w:r>
+        <w:rPr>
+          <w:noProof/>
+          <w:lang w:eastAsia="es-MX"/>
+        </w:rPr>
+        <w:drawing>
+          <wp:inline distT="0" distB="0" distL="0" distR="0" wp14:anchorId="73E212BE" wp14:editId="269505C6">
+            <wp:extent cx="2785682" cy="1952625"/>
+            <wp:effectExtent l="0" t="0" r="0" b="0"/>
+            <wp:docPr id="5" name="Imagen 5"/>
+            <wp:cNvGraphicFramePr>
+              <a:graphicFrameLocks xmlns:a="http://schemas.openxmlformats.org/drawingml/2006/main" noChangeAspect="1"/>
+            </wp:cNvGraphicFramePr>
+            <a:graphic xmlns:a="http://schemas.openxmlformats.org/drawingml/2006/main">
+              <a:graphicData uri="http://schemas.openxmlformats.org/drawingml/2006/picture">
+                <pic:pic xmlns:pic="http://schemas.openxmlformats.org/drawingml/2006/picture">
+                  <pic:nvPicPr>
+                    <pic:cNvPr id="1" name=""/>
+                    <pic:cNvPicPr/>
+                  </pic:nvPicPr>
+                  <pic:blipFill>
+                    <a:blip r:embed="rId10"/>
+                    <a:stretch>
+                      <a:fillRect/>
+                    </a:stretch>
+                  </pic:blipFill>
+                  <pic:spPr>
+                    <a:xfrm>
+                      <a:off x="0" y="0"/>
+                      <a:ext cx="2791160" cy="1956465"/>
+                    </a:xfrm>
+                    <a:prstGeom prst="rect">
+                      <a:avLst/>
+                    </a:prstGeom>
+                  </pic:spPr>
+                </pic:pic>
+              </a:graphicData>
+            </a:graphic>
+          </wp:inline>
+        </w:drawing>
+      </w:r>
+    </w:p>
+    <w:p>
+      <w:pPr>
+        <w:pStyle w:val="Prrafodelista"/>
+      </w:pPr>
+    </w:p>
+    <w:p>
+      <w:pPr>
+        <w:ind w:left="360"/>
+        <w:rPr>
+          <w:b/>
+        </w:rPr>
+      </w:pPr>
+    </w:p>
+    <w:p>
+      <w:pPr>
+        <w:ind w:left="360"/>
+        <w:rPr>
+          <w:b/>
+        </w:rPr>
+      </w:pPr>
+    </w:p>
+    <w:p>
+      <w:pPr>
+        <w:ind w:left="360"/>
+        <w:rPr>
+          <w:b/>
+        </w:rPr>
+      </w:pPr>
+    </w:p>
+    <w:p>
+      <w:pPr>
+        <w:ind w:left="360"/>
+        <w:rPr>
+          <w:b/>
+        </w:rPr>
+      </w:pPr>
+    </w:p>
+    <w:p>
+      <w:pPr>
+        <w:ind w:left="360"/>
+        <w:rPr>
+          <w:b/>
+        </w:rPr>
+      </w:pPr>
+    </w:p>
+    <w:p>
+      <w:pPr>
+        <w:ind w:left="360"/>
+        <w:rPr>
+          <w:b/>
+        </w:rPr>
+      </w:pPr>
+    </w:p>
+    <w:p>
+      <w:pPr>
+        <w:ind w:left="360"/>
+        <w:rPr>
+          <w:b/>
+        </w:rPr>
+      </w:pPr>
+    </w:p>
+    <w:p>
+      <w:pPr>
+        <w:ind w:left="360"/>
+        <w:rPr>
+          <w:b/>
+        </w:rPr>
+      </w:pPr>
+      <w:r>
+        <w:rPr>
+          <w:b/>
+        </w:rPr>
+        <w:lastRenderedPageBreak/>
         <w:t>Mostrar cuantos clientes hay por tienda</w:t>
       </w:r>
     </w:p>
     <w:p>
       <w:pPr>
-        <w:pStyle w:val="Prrafodelista"/>
-        <w:numPr>
-          <w:ilvl w:val="0"/>
-          <w:numId w:val="1"/>
-        </w:numPr>
-      </w:pPr>
-      <w:r>
+        <w:ind w:left="360"/>
+        <w:rPr>
+          <w:b/>
+        </w:rPr>
+      </w:pPr>
+      <w:hyperlink r:id="rId11" w:tgtFrame="mysql_doc" w:history="1">
+        <w:r>
+          <w:rPr>
+            <w:rStyle w:val="Hipervnculo"/>
+            <w:rFonts w:ascii="Courier New" w:hAnsi="Courier New" w:cs="Courier New"/>
+            <w:sz w:val="20"/>
+            <w:szCs w:val="20"/>
+            <w:u w:val="none"/>
+            <w:shd w:val="clear" w:color="auto" w:fill="E5E5E5"/>
+          </w:rPr>
+          <w:t>SELECT</w:t>
+        </w:r>
+      </w:hyperlink>
+      <w:r>
+        <w:rPr>
+          <w:rFonts w:ascii="Courier New" w:hAnsi="Courier New" w:cs="Courier New"/>
+          <w:color w:val="444444"/>
+          <w:sz w:val="20"/>
+          <w:szCs w:val="20"/>
+          <w:shd w:val="clear" w:color="auto" w:fill="E5E5E5"/>
+        </w:rPr>
+        <w:t> s</w:t>
+      </w:r>
+      <w:r>
+        <w:rPr>
+          <w:rStyle w:val="cm-variable-2"/>
+          <w:rFonts w:ascii="Courier New" w:hAnsi="Courier New" w:cs="Courier New"/>
+          <w:color w:val="0055AA"/>
+          <w:sz w:val="20"/>
+          <w:szCs w:val="20"/>
+          <w:shd w:val="clear" w:color="auto" w:fill="E5E5E5"/>
+        </w:rPr>
+        <w:t>.store_id</w:t>
+      </w:r>
+      <w:r>
+        <w:rPr>
+          <w:rFonts w:ascii="Courier New" w:hAnsi="Courier New" w:cs="Courier New"/>
+          <w:color w:val="444444"/>
+          <w:sz w:val="20"/>
+          <w:szCs w:val="20"/>
+          <w:shd w:val="clear" w:color="auto" w:fill="E5E5E5"/>
+        </w:rPr>
+        <w:t> </w:t>
+      </w:r>
+      <w:r>
+        <w:rPr>
+          <w:rStyle w:val="cm-keyword"/>
+          <w:rFonts w:ascii="Courier New" w:hAnsi="Courier New" w:cs="Courier New"/>
+          <w:color w:val="770088"/>
+          <w:sz w:val="20"/>
+          <w:szCs w:val="20"/>
+          <w:shd w:val="clear" w:color="auto" w:fill="E5E5E5"/>
+        </w:rPr>
+        <w:t>AS</w:t>
+      </w:r>
+      <w:r>
+        <w:rPr>
+          <w:rFonts w:ascii="Courier New" w:hAnsi="Courier New" w:cs="Courier New"/>
+          <w:color w:val="444444"/>
+          <w:sz w:val="20"/>
+          <w:szCs w:val="20"/>
+          <w:shd w:val="clear" w:color="auto" w:fill="E5E5E5"/>
+        </w:rPr>
+        <w:t> tienda</w:t>
+      </w:r>
+      <w:r>
+        <w:rPr>
+          <w:rStyle w:val="cm-punctuation"/>
+          <w:rFonts w:ascii="Courier New" w:hAnsi="Courier New" w:cs="Courier New"/>
+          <w:color w:val="444444"/>
+          <w:sz w:val="20"/>
+          <w:szCs w:val="20"/>
+          <w:shd w:val="clear" w:color="auto" w:fill="E5E5E5"/>
+        </w:rPr>
+        <w:t>,</w:t>
+      </w:r>
+      <w:r>
+        <w:rPr>
+          <w:rFonts w:ascii="Courier New" w:hAnsi="Courier New" w:cs="Courier New"/>
+          <w:color w:val="444444"/>
+          <w:sz w:val="20"/>
+          <w:szCs w:val="20"/>
+          <w:shd w:val="clear" w:color="auto" w:fill="E5E5E5"/>
+        </w:rPr>
+        <w:t> </w:t>
+      </w:r>
+      <w:hyperlink r:id="rId12" w:tgtFrame="mysql_doc" w:history="1">
+        <w:r>
+          <w:rPr>
+            <w:rStyle w:val="Hipervnculo"/>
+            <w:rFonts w:ascii="Courier New" w:hAnsi="Courier New" w:cs="Courier New"/>
+            <w:sz w:val="20"/>
+            <w:szCs w:val="20"/>
+            <w:u w:val="none"/>
+            <w:shd w:val="clear" w:color="auto" w:fill="E5E5E5"/>
+          </w:rPr>
+          <w:t>COUNT</w:t>
+        </w:r>
+      </w:hyperlink>
+      <w:r>
+        <w:rPr>
+          <w:rStyle w:val="cm-bracket"/>
+          <w:rFonts w:ascii="Courier New" w:hAnsi="Courier New" w:cs="Courier New"/>
+          <w:color w:val="999977"/>
+          <w:sz w:val="20"/>
+          <w:szCs w:val="20"/>
+          <w:shd w:val="clear" w:color="auto" w:fill="E5E5E5"/>
+        </w:rPr>
+        <w:t>(</w:t>
+      </w:r>
+      <w:r>
+        <w:rPr>
+          <w:rFonts w:ascii="Courier New" w:hAnsi="Courier New" w:cs="Courier New"/>
+          <w:color w:val="444444"/>
+          <w:sz w:val="20"/>
+          <w:szCs w:val="20"/>
+          <w:shd w:val="clear" w:color="auto" w:fill="E5E5E5"/>
+        </w:rPr>
+        <w:t>c</w:t>
+      </w:r>
+      <w:r>
+        <w:rPr>
+          <w:rStyle w:val="cm-variable-2"/>
+          <w:rFonts w:ascii="Courier New" w:hAnsi="Courier New" w:cs="Courier New"/>
+          <w:color w:val="0055AA"/>
+          <w:sz w:val="20"/>
+          <w:szCs w:val="20"/>
+          <w:shd w:val="clear" w:color="auto" w:fill="E5E5E5"/>
+        </w:rPr>
+        <w:t>.customer_id</w:t>
+      </w:r>
+      <w:r>
+        <w:rPr>
+          <w:rStyle w:val="cm-bracket"/>
+          <w:rFonts w:ascii="Courier New" w:hAnsi="Courier New" w:cs="Courier New"/>
+          <w:color w:val="999977"/>
+          <w:sz w:val="20"/>
+          <w:szCs w:val="20"/>
+          <w:shd w:val="clear" w:color="auto" w:fill="E5E5E5"/>
+        </w:rPr>
+        <w:t>)</w:t>
+      </w:r>
+      <w:r>
+        <w:rPr>
+          <w:rFonts w:ascii="Courier New" w:hAnsi="Courier New" w:cs="Courier New"/>
+          <w:color w:val="444444"/>
+          <w:sz w:val="20"/>
+          <w:szCs w:val="20"/>
+          <w:shd w:val="clear" w:color="auto" w:fill="E5E5E5"/>
+        </w:rPr>
+        <w:t> </w:t>
+      </w:r>
+      <w:r>
+        <w:rPr>
+          <w:rStyle w:val="cm-keyword"/>
+          <w:rFonts w:ascii="Courier New" w:hAnsi="Courier New" w:cs="Courier New"/>
+          <w:color w:val="770088"/>
+          <w:sz w:val="20"/>
+          <w:szCs w:val="20"/>
+          <w:shd w:val="clear" w:color="auto" w:fill="E5E5E5"/>
+        </w:rPr>
+        <w:t>AS</w:t>
+      </w:r>
+      <w:r>
+        <w:rPr>
+          <w:rFonts w:ascii="Courier New" w:hAnsi="Courier New" w:cs="Courier New"/>
+          <w:color w:val="444444"/>
+          <w:sz w:val="20"/>
+          <w:szCs w:val="20"/>
+          <w:shd w:val="clear" w:color="auto" w:fill="E5E5E5"/>
+        </w:rPr>
+        <w:t> clientes </w:t>
+      </w:r>
+      <w:r>
+        <w:rPr>
+          <w:rStyle w:val="cm-keyword"/>
+          <w:rFonts w:ascii="Courier New" w:hAnsi="Courier New" w:cs="Courier New"/>
+          <w:color w:val="770088"/>
+          <w:sz w:val="20"/>
+          <w:szCs w:val="20"/>
+          <w:shd w:val="clear" w:color="auto" w:fill="E5E5E5"/>
+        </w:rPr>
+        <w:t>from</w:t>
+      </w:r>
+      <w:r>
+        <w:rPr>
+          <w:rFonts w:ascii="Courier New" w:hAnsi="Courier New" w:cs="Courier New"/>
+          <w:color w:val="444444"/>
+          <w:sz w:val="20"/>
+          <w:szCs w:val="20"/>
+          <w:shd w:val="clear" w:color="auto" w:fill="E5E5E5"/>
+        </w:rPr>
+        <w:t> customer c </w:t>
+      </w:r>
+      <w:r>
+        <w:rPr>
+          <w:rStyle w:val="cm-keyword"/>
+          <w:rFonts w:ascii="Courier New" w:hAnsi="Courier New" w:cs="Courier New"/>
+          <w:color w:val="770088"/>
+          <w:sz w:val="20"/>
+          <w:szCs w:val="20"/>
+          <w:shd w:val="clear" w:color="auto" w:fill="E5E5E5"/>
+        </w:rPr>
+        <w:t>INNER</w:t>
+      </w:r>
+      <w:r>
+        <w:rPr>
+          <w:rFonts w:ascii="Courier New" w:hAnsi="Courier New" w:cs="Courier New"/>
+          <w:color w:val="444444"/>
+          <w:sz w:val="20"/>
+          <w:szCs w:val="20"/>
+          <w:shd w:val="clear" w:color="auto" w:fill="E5E5E5"/>
+        </w:rPr>
+        <w:t> </w:t>
+      </w:r>
+      <w:r>
+        <w:rPr>
+          <w:rStyle w:val="cm-keyword"/>
+          <w:rFonts w:ascii="Courier New" w:hAnsi="Courier New" w:cs="Courier New"/>
+          <w:color w:val="770088"/>
+          <w:sz w:val="20"/>
+          <w:szCs w:val="20"/>
+          <w:shd w:val="clear" w:color="auto" w:fill="E5E5E5"/>
+        </w:rPr>
+        <w:t>JOIN</w:t>
+      </w:r>
+      <w:r>
+        <w:rPr>
+          <w:rFonts w:ascii="Courier New" w:hAnsi="Courier New" w:cs="Courier New"/>
+          <w:color w:val="444444"/>
+          <w:sz w:val="20"/>
+          <w:szCs w:val="20"/>
+          <w:shd w:val="clear" w:color="auto" w:fill="E5E5E5"/>
+        </w:rPr>
+        <w:t> store s </w:t>
+      </w:r>
+      <w:r>
+        <w:rPr>
+          <w:rStyle w:val="cm-keyword"/>
+          <w:rFonts w:ascii="Courier New" w:hAnsi="Courier New" w:cs="Courier New"/>
+          <w:color w:val="770088"/>
+          <w:sz w:val="20"/>
+          <w:szCs w:val="20"/>
+          <w:shd w:val="clear" w:color="auto" w:fill="E5E5E5"/>
+        </w:rPr>
+        <w:t>GROUP</w:t>
+      </w:r>
+      <w:r>
+        <w:rPr>
+          <w:rFonts w:ascii="Courier New" w:hAnsi="Courier New" w:cs="Courier New"/>
+          <w:color w:val="444444"/>
+          <w:sz w:val="20"/>
+          <w:szCs w:val="20"/>
+          <w:shd w:val="clear" w:color="auto" w:fill="E5E5E5"/>
+        </w:rPr>
+        <w:t> </w:t>
+      </w:r>
+      <w:r>
+        <w:rPr>
+          <w:rStyle w:val="cm-keyword"/>
+          <w:rFonts w:ascii="Courier New" w:hAnsi="Courier New" w:cs="Courier New"/>
+          <w:color w:val="770088"/>
+          <w:sz w:val="20"/>
+          <w:szCs w:val="20"/>
+          <w:shd w:val="clear" w:color="auto" w:fill="E5E5E5"/>
+        </w:rPr>
+        <w:t>BY</w:t>
+      </w:r>
+      <w:r>
+        <w:rPr>
+          <w:rFonts w:ascii="Courier New" w:hAnsi="Courier New" w:cs="Courier New"/>
+          <w:color w:val="444444"/>
+          <w:sz w:val="20"/>
+          <w:szCs w:val="20"/>
+          <w:shd w:val="clear" w:color="auto" w:fill="E5E5E5"/>
+        </w:rPr>
+        <w:t> s</w:t>
+      </w:r>
+      <w:r>
+        <w:rPr>
+          <w:rStyle w:val="cm-variable-2"/>
+          <w:rFonts w:ascii="Courier New" w:hAnsi="Courier New" w:cs="Courier New"/>
+          <w:color w:val="0055AA"/>
+          <w:sz w:val="20"/>
+          <w:szCs w:val="20"/>
+          <w:shd w:val="clear" w:color="auto" w:fill="E5E5E5"/>
+        </w:rPr>
+        <w:t>.store_id</w:t>
+      </w:r>
+      <w:r>
+        <w:rPr>
+          <w:rStyle w:val="cm-punctuation"/>
+          <w:rFonts w:ascii="Courier New" w:hAnsi="Courier New" w:cs="Courier New"/>
+          <w:color w:val="444444"/>
+          <w:sz w:val="20"/>
+          <w:szCs w:val="20"/>
+          <w:shd w:val="clear" w:color="auto" w:fill="E5E5E5"/>
+        </w:rPr>
+        <w:t>;</w:t>
+      </w:r>
+    </w:p>
+    <w:p>
+      <w:pPr>
+        <w:ind w:left="360"/>
+        <w:rPr>
+          <w:b/>
+        </w:rPr>
+      </w:pPr>
+      <w:r>
+        <w:rPr>
+          <w:b/>
+          <w:noProof/>
+          <w:lang w:eastAsia="es-MX"/>
+        </w:rPr>
+        <w:drawing>
+          <wp:inline distT="0" distB="0" distL="0" distR="0" wp14:anchorId="3273C60F" wp14:editId="41541D56">
+            <wp:extent cx="5612130" cy="1543685"/>
+            <wp:effectExtent l="0" t="0" r="7620" b="0"/>
+            <wp:docPr id="6" name="Imagen 6"/>
+            <wp:cNvGraphicFramePr>
+              <a:graphicFrameLocks xmlns:a="http://schemas.openxmlformats.org/drawingml/2006/main" noChangeAspect="1"/>
+            </wp:cNvGraphicFramePr>
+            <a:graphic xmlns:a="http://schemas.openxmlformats.org/drawingml/2006/main">
+              <a:graphicData uri="http://schemas.openxmlformats.org/drawingml/2006/picture">
+                <pic:pic xmlns:pic="http://schemas.openxmlformats.org/drawingml/2006/picture">
+                  <pic:nvPicPr>
+                    <pic:cNvPr id="1" name=""/>
+                    <pic:cNvPicPr/>
+                  </pic:nvPicPr>
+                  <pic:blipFill>
+                    <a:blip r:embed="rId13"/>
+                    <a:stretch>
+                      <a:fillRect/>
+                    </a:stretch>
+                  </pic:blipFill>
+                  <pic:spPr>
+                    <a:xfrm>
+                      <a:off x="0" y="0"/>
+                      <a:ext cx="5612130" cy="1543685"/>
+                    </a:xfrm>
+                    <a:prstGeom prst="rect">
+                      <a:avLst/>
+                    </a:prstGeom>
+                  </pic:spPr>
+                </pic:pic>
+              </a:graphicData>
+            </a:graphic>
+          </wp:inline>
+        </w:drawing>
+      </w:r>
+    </w:p>
+    <w:p>
+      <w:pPr>
+        <w:pStyle w:val="Prrafodelista"/>
+        <w:rPr>
+          <w:b/>
+        </w:rPr>
+      </w:pPr>
+      <w:r>
+        <w:rPr>
+          <w:b/>
+        </w:rPr>
+        <w:t xml:space="preserve"> </w:t>
+      </w:r>
+      <w:r>
+        <w:rPr>
+          <w:b/>
+        </w:rPr>
         <w:t>Contar cuantos actores hay en cada película</w:t>
       </w:r>
     </w:p>
     <w:p>
       <w:pPr>
         <w:pStyle w:val="Prrafodelista"/>
-        <w:numPr>
-          <w:ilvl w:val="0"/>
-          <w:numId w:val="1"/>
-        </w:numPr>
-      </w:pPr>
-      <w:r>
+        <w:rPr>
+          <w:b/>
+        </w:rPr>
+      </w:pPr>
+    </w:p>
+    <w:p>
+      <w:pPr>
+        <w:pStyle w:val="Prrafodelista"/>
+        <w:rPr>
+          <w:b/>
+        </w:rPr>
+      </w:pPr>
+      <w:r>
+        <w:rPr>
+          <w:b/>
+          <w:noProof/>
+          <w:lang w:eastAsia="es-MX"/>
+        </w:rPr>
+        <w:drawing>
+          <wp:inline distT="0" distB="0" distL="0" distR="0" wp14:anchorId="4F591234" wp14:editId="086D9670">
+            <wp:extent cx="5612130" cy="2905760"/>
+            <wp:effectExtent l="0" t="0" r="7620" b="8890"/>
+            <wp:docPr id="7" name="Imagen 7"/>
+            <wp:cNvGraphicFramePr>
+              <a:graphicFrameLocks xmlns:a="http://schemas.openxmlformats.org/drawingml/2006/main" noChangeAspect="1"/>
+            </wp:cNvGraphicFramePr>
+            <a:graphic xmlns:a="http://schemas.openxmlformats.org/drawingml/2006/main">
+              <a:graphicData uri="http://schemas.openxmlformats.org/drawingml/2006/picture">
+                <pic:pic xmlns:pic="http://schemas.openxmlformats.org/drawingml/2006/picture">
+                  <pic:nvPicPr>
+                    <pic:cNvPr id="1" name=""/>
+                    <pic:cNvPicPr/>
+                  </pic:nvPicPr>
+                  <pic:blipFill>
+                    <a:blip r:embed="rId14"/>
+                    <a:stretch>
+                      <a:fillRect/>
+                    </a:stretch>
+                  </pic:blipFill>
+                  <pic:spPr>
+                    <a:xfrm>
+                      <a:off x="0" y="0"/>
+                      <a:ext cx="5612130" cy="2905760"/>
+                    </a:xfrm>
+                    <a:prstGeom prst="rect">
+                      <a:avLst/>
+                    </a:prstGeom>
+                  </pic:spPr>
+                </pic:pic>
+              </a:graphicData>
+            </a:graphic>
+          </wp:inline>
+        </w:drawing>
+      </w:r>
+    </w:p>
+    <w:p>
+      <w:pPr>
+        <w:pStyle w:val="Prrafodelista"/>
+        <w:rPr>
+          <w:b/>
+        </w:rPr>
+      </w:pPr>
+      <w:r>
+        <w:rPr>
+          <w:b/>
+        </w:rPr>
+        <w:t xml:space="preserve"> </w:t>
+      </w:r>
+      <w:r>
+        <w:rPr>
+          <w:b/>
+        </w:rPr>
         <w:t>Mostrar las 5 películas más rentada</w:t>
       </w:r>
     </w:p>
     <w:p>
       <w:pPr>
         <w:pStyle w:val="Prrafodelista"/>
-        <w:numPr>
-          <w:ilvl w:val="0"/>
-          <w:numId w:val="1"/>
-        </w:numPr>
-      </w:pPr>
-      <w:r>
+        <w:rPr>
+          <w:b/>
+        </w:rPr>
+      </w:pPr>
+      <w:r>
+        <w:rPr>
+          <w:b/>
+          <w:noProof/>
+          <w:lang w:eastAsia="es-MX"/>
+        </w:rPr>
+        <w:drawing>
+          <wp:inline distT="0" distB="0" distL="0" distR="0" wp14:anchorId="35F7422F" wp14:editId="51D57794">
+            <wp:extent cx="5612130" cy="898525"/>
+            <wp:effectExtent l="0" t="0" r="7620" b="0"/>
+            <wp:docPr id="8" name="Imagen 8"/>
+            <wp:cNvGraphicFramePr>
+              <a:graphicFrameLocks xmlns:a="http://schemas.openxmlformats.org/drawingml/2006/main" noChangeAspect="1"/>
+            </wp:cNvGraphicFramePr>
+            <a:graphic xmlns:a="http://schemas.openxmlformats.org/drawingml/2006/main">
+              <a:graphicData uri="http://schemas.openxmlformats.org/drawingml/2006/picture">
+                <pic:pic xmlns:pic="http://schemas.openxmlformats.org/drawingml/2006/picture">
+                  <pic:nvPicPr>
+                    <pic:cNvPr id="1" name=""/>
+                    <pic:cNvPicPr/>
+                  </pic:nvPicPr>
+                  <pic:blipFill>
+                    <a:blip r:embed="rId15"/>
+                    <a:stretch>
+                      <a:fillRect/>
+                    </a:stretch>
+                  </pic:blipFill>
+                  <pic:spPr>
+                    <a:xfrm>
+                      <a:off x="0" y="0"/>
+                      <a:ext cx="5612130" cy="898525"/>
+                    </a:xfrm>
+                    <a:prstGeom prst="rect">
+                      <a:avLst/>
+                    </a:prstGeom>
+                  </pic:spPr>
+                </pic:pic>
+              </a:graphicData>
+            </a:graphic>
+          </wp:inline>
+        </w:drawing>
+      </w:r>
+    </w:p>
+    <w:p>
+      <w:pPr>
+        <w:pStyle w:val="Prrafodelista"/>
+        <w:rPr>
+          <w:b/>
+        </w:rPr>
+      </w:pPr>
+      <w:r>
+        <w:rPr>
+          <w:b/>
+        </w:rPr>
         <w:t>Mostrar cuantas películas hay por idioma</w:t>
       </w:r>
     </w:p>
     <w:p>
       <w:pPr>
         <w:pStyle w:val="Prrafodelista"/>
-        <w:numPr>
-          <w:ilvl w:val="0"/>
-          <w:numId w:val="1"/>
-        </w:numPr>
-      </w:pPr>
-      <w:r>
+        <w:rPr>
+          <w:b/>
+        </w:rPr>
+      </w:pPr>
+      <w:r>
+        <w:rPr>
+          <w:b/>
+          <w:noProof/>
+          <w:lang w:eastAsia="es-MX"/>
+        </w:rPr>
+        <w:drawing>
+          <wp:inline distT="0" distB="0" distL="0" distR="0" wp14:anchorId="401828F7" wp14:editId="5A598F4D">
+            <wp:extent cx="5612130" cy="1167765"/>
+            <wp:effectExtent l="0" t="0" r="7620" b="0"/>
+            <wp:docPr id="9" name="Imagen 9"/>
+            <wp:cNvGraphicFramePr>
+              <a:graphicFrameLocks xmlns:a="http://schemas.openxmlformats.org/drawingml/2006/main" noChangeAspect="1"/>
+            </wp:cNvGraphicFramePr>
+            <a:graphic xmlns:a="http://schemas.openxmlformats.org/drawingml/2006/main">
+              <a:graphicData uri="http://schemas.openxmlformats.org/drawingml/2006/picture">
+                <pic:pic xmlns:pic="http://schemas.openxmlformats.org/drawingml/2006/picture">
+                  <pic:nvPicPr>
+                    <pic:cNvPr id="1" name=""/>
+                    <pic:cNvPicPr/>
+                  </pic:nvPicPr>
+                  <pic:blipFill>
+                    <a:blip r:embed="rId16"/>
+                    <a:stretch>
+                      <a:fillRect/>
+                    </a:stretch>
+                  </pic:blipFill>
+                  <pic:spPr>
+                    <a:xfrm>
+                      <a:off x="0" y="0"/>
+                      <a:ext cx="5612130" cy="1167765"/>
+                    </a:xfrm>
+                    <a:prstGeom prst="rect">
+                      <a:avLst/>
+                    </a:prstGeom>
+                  </pic:spPr>
+                </pic:pic>
+              </a:graphicData>
+            </a:graphic>
+          </wp:inline>
+        </w:drawing>
+      </w:r>
+    </w:p>
+    <w:p>
+      <w:pPr>
+        <w:pStyle w:val="Prrafodelista"/>
+        <w:ind w:left="1080"/>
+        <w:rPr>
+          <w:b/>
+        </w:rPr>
+      </w:pPr>
+      <w:r>
+        <w:rPr>
+          <w:b/>
+        </w:rPr>
+        <w:lastRenderedPageBreak/>
         <w:t>Mostrar el total de rentas realizadas por cada tienda</w:t>
+      </w:r>
+    </w:p>
+    <w:p>
+      <w:pPr>
+        <w:pStyle w:val="Prrafodelista"/>
+        <w:ind w:left="1080"/>
+        <w:rPr>
+          <w:b/>
+        </w:rPr>
+      </w:pPr>
+      <w:hyperlink r:id="rId17" w:tgtFrame="mysql_doc" w:history="1">
+        <w:r>
+          <w:rPr>
+            <w:rStyle w:val="Hipervnculo"/>
+            <w:rFonts w:ascii="Courier New" w:hAnsi="Courier New" w:cs="Courier New"/>
+            <w:sz w:val="20"/>
+            <w:szCs w:val="20"/>
+            <w:u w:val="none"/>
+            <w:shd w:val="clear" w:color="auto" w:fill="E5E5E5"/>
+          </w:rPr>
+          <w:t>SELECT</w:t>
+        </w:r>
+      </w:hyperlink>
+      <w:r>
+        <w:rPr>
+          <w:rFonts w:ascii="Courier New" w:hAnsi="Courier New" w:cs="Courier New"/>
+          <w:color w:val="444444"/>
+          <w:sz w:val="20"/>
+          <w:szCs w:val="20"/>
+          <w:shd w:val="clear" w:color="auto" w:fill="E5E5E5"/>
+        </w:rPr>
+        <w:t> s</w:t>
+      </w:r>
+      <w:r>
+        <w:rPr>
+          <w:rStyle w:val="cm-variable-2"/>
+          <w:rFonts w:ascii="Courier New" w:hAnsi="Courier New" w:cs="Courier New"/>
+          <w:color w:val="0055AA"/>
+          <w:sz w:val="20"/>
+          <w:szCs w:val="20"/>
+          <w:shd w:val="clear" w:color="auto" w:fill="E5E5E5"/>
+        </w:rPr>
+        <w:t>.store_id</w:t>
+      </w:r>
+      <w:r>
+        <w:rPr>
+          <w:rFonts w:ascii="Courier New" w:hAnsi="Courier New" w:cs="Courier New"/>
+          <w:color w:val="444444"/>
+          <w:sz w:val="20"/>
+          <w:szCs w:val="20"/>
+          <w:shd w:val="clear" w:color="auto" w:fill="E5E5E5"/>
+        </w:rPr>
+        <w:t> </w:t>
+      </w:r>
+      <w:r>
+        <w:rPr>
+          <w:rStyle w:val="cm-keyword"/>
+          <w:rFonts w:ascii="Courier New" w:hAnsi="Courier New" w:cs="Courier New"/>
+          <w:color w:val="770088"/>
+          <w:sz w:val="20"/>
+          <w:szCs w:val="20"/>
+          <w:shd w:val="clear" w:color="auto" w:fill="E5E5E5"/>
+        </w:rPr>
+        <w:t>AS</w:t>
+      </w:r>
+      <w:r>
+        <w:rPr>
+          <w:rFonts w:ascii="Courier New" w:hAnsi="Courier New" w:cs="Courier New"/>
+          <w:color w:val="444444"/>
+          <w:sz w:val="20"/>
+          <w:szCs w:val="20"/>
+          <w:shd w:val="clear" w:color="auto" w:fill="E5E5E5"/>
+        </w:rPr>
+        <w:t> tienda</w:t>
+      </w:r>
+      <w:r>
+        <w:rPr>
+          <w:rStyle w:val="cm-punctuation"/>
+          <w:rFonts w:ascii="Courier New" w:hAnsi="Courier New" w:cs="Courier New"/>
+          <w:color w:val="444444"/>
+          <w:sz w:val="20"/>
+          <w:szCs w:val="20"/>
+          <w:shd w:val="clear" w:color="auto" w:fill="E5E5E5"/>
+        </w:rPr>
+        <w:t>,</w:t>
+      </w:r>
+      <w:r>
+        <w:rPr>
+          <w:rFonts w:ascii="Courier New" w:hAnsi="Courier New" w:cs="Courier New"/>
+          <w:color w:val="444444"/>
+          <w:sz w:val="20"/>
+          <w:szCs w:val="20"/>
+          <w:shd w:val="clear" w:color="auto" w:fill="E5E5E5"/>
+        </w:rPr>
+        <w:t> </w:t>
+      </w:r>
+      <w:hyperlink r:id="rId18" w:tgtFrame="mysql_doc" w:history="1">
+        <w:r>
+          <w:rPr>
+            <w:rStyle w:val="Hipervnculo"/>
+            <w:rFonts w:ascii="Courier New" w:hAnsi="Courier New" w:cs="Courier New"/>
+            <w:sz w:val="20"/>
+            <w:szCs w:val="20"/>
+            <w:u w:val="none"/>
+            <w:shd w:val="clear" w:color="auto" w:fill="E5E5E5"/>
+          </w:rPr>
+          <w:t>Count</w:t>
+        </w:r>
+      </w:hyperlink>
+      <w:r>
+        <w:rPr>
+          <w:rStyle w:val="cm-bracket"/>
+          <w:rFonts w:ascii="Courier New" w:hAnsi="Courier New" w:cs="Courier New"/>
+          <w:color w:val="999977"/>
+          <w:sz w:val="20"/>
+          <w:szCs w:val="20"/>
+          <w:shd w:val="clear" w:color="auto" w:fill="E5E5E5"/>
+        </w:rPr>
+        <w:t>(</w:t>
+      </w:r>
+      <w:r>
+        <w:rPr>
+          <w:rFonts w:ascii="Courier New" w:hAnsi="Courier New" w:cs="Courier New"/>
+          <w:color w:val="444444"/>
+          <w:sz w:val="20"/>
+          <w:szCs w:val="20"/>
+          <w:shd w:val="clear" w:color="auto" w:fill="E5E5E5"/>
+        </w:rPr>
+        <w:t>r</w:t>
+      </w:r>
+      <w:r>
+        <w:rPr>
+          <w:rStyle w:val="cm-variable-2"/>
+          <w:rFonts w:ascii="Courier New" w:hAnsi="Courier New" w:cs="Courier New"/>
+          <w:color w:val="0055AA"/>
+          <w:sz w:val="20"/>
+          <w:szCs w:val="20"/>
+          <w:shd w:val="clear" w:color="auto" w:fill="E5E5E5"/>
+        </w:rPr>
+        <w:t>.rental_id</w:t>
+      </w:r>
+      <w:r>
+        <w:rPr>
+          <w:rStyle w:val="cm-bracket"/>
+          <w:rFonts w:ascii="Courier New" w:hAnsi="Courier New" w:cs="Courier New"/>
+          <w:color w:val="999977"/>
+          <w:sz w:val="20"/>
+          <w:szCs w:val="20"/>
+          <w:shd w:val="clear" w:color="auto" w:fill="E5E5E5"/>
+        </w:rPr>
+        <w:t>)</w:t>
+      </w:r>
+      <w:r>
+        <w:rPr>
+          <w:rFonts w:ascii="Courier New" w:hAnsi="Courier New" w:cs="Courier New"/>
+          <w:color w:val="444444"/>
+          <w:sz w:val="20"/>
+          <w:szCs w:val="20"/>
+          <w:shd w:val="clear" w:color="auto" w:fill="E5E5E5"/>
+        </w:rPr>
+        <w:t> </w:t>
+      </w:r>
+      <w:r>
+        <w:rPr>
+          <w:rStyle w:val="cm-keyword"/>
+          <w:rFonts w:ascii="Courier New" w:hAnsi="Courier New" w:cs="Courier New"/>
+          <w:color w:val="770088"/>
+          <w:sz w:val="20"/>
+          <w:szCs w:val="20"/>
+          <w:shd w:val="clear" w:color="auto" w:fill="E5E5E5"/>
+        </w:rPr>
+        <w:t>AS</w:t>
+      </w:r>
+      <w:r>
+        <w:rPr>
+          <w:rFonts w:ascii="Courier New" w:hAnsi="Courier New" w:cs="Courier New"/>
+          <w:color w:val="444444"/>
+          <w:sz w:val="20"/>
+          <w:szCs w:val="20"/>
+          <w:shd w:val="clear" w:color="auto" w:fill="E5E5E5"/>
+        </w:rPr>
+        <w:t> total_rentas </w:t>
+      </w:r>
+      <w:r>
+        <w:rPr>
+          <w:rStyle w:val="cm-keyword"/>
+          <w:rFonts w:ascii="Courier New" w:hAnsi="Courier New" w:cs="Courier New"/>
+          <w:color w:val="770088"/>
+          <w:sz w:val="20"/>
+          <w:szCs w:val="20"/>
+          <w:shd w:val="clear" w:color="auto" w:fill="E5E5E5"/>
+        </w:rPr>
+        <w:t>FROM</w:t>
+      </w:r>
+      <w:r>
+        <w:rPr>
+          <w:rFonts w:ascii="Courier New" w:hAnsi="Courier New" w:cs="Courier New"/>
+          <w:color w:val="444444"/>
+          <w:sz w:val="20"/>
+          <w:szCs w:val="20"/>
+          <w:shd w:val="clear" w:color="auto" w:fill="E5E5E5"/>
+        </w:rPr>
+        <w:t> Store s </w:t>
+      </w:r>
+      <w:r>
+        <w:rPr>
+          <w:rStyle w:val="cm-keyword"/>
+          <w:rFonts w:ascii="Courier New" w:hAnsi="Courier New" w:cs="Courier New"/>
+          <w:color w:val="770088"/>
+          <w:sz w:val="20"/>
+          <w:szCs w:val="20"/>
+          <w:shd w:val="clear" w:color="auto" w:fill="E5E5E5"/>
+        </w:rPr>
+        <w:t>INNER</w:t>
+      </w:r>
+      <w:r>
+        <w:rPr>
+          <w:rFonts w:ascii="Courier New" w:hAnsi="Courier New" w:cs="Courier New"/>
+          <w:color w:val="444444"/>
+          <w:sz w:val="20"/>
+          <w:szCs w:val="20"/>
+          <w:shd w:val="clear" w:color="auto" w:fill="E5E5E5"/>
+        </w:rPr>
+        <w:t> </w:t>
+      </w:r>
+      <w:r>
+        <w:rPr>
+          <w:rStyle w:val="cm-keyword"/>
+          <w:rFonts w:ascii="Courier New" w:hAnsi="Courier New" w:cs="Courier New"/>
+          <w:color w:val="770088"/>
+          <w:sz w:val="20"/>
+          <w:szCs w:val="20"/>
+          <w:shd w:val="clear" w:color="auto" w:fill="E5E5E5"/>
+        </w:rPr>
+        <w:t>JOIN</w:t>
+      </w:r>
+      <w:r>
+        <w:rPr>
+          <w:rFonts w:ascii="Courier New" w:hAnsi="Courier New" w:cs="Courier New"/>
+          <w:color w:val="444444"/>
+          <w:sz w:val="20"/>
+          <w:szCs w:val="20"/>
+          <w:shd w:val="clear" w:color="auto" w:fill="E5E5E5"/>
+        </w:rPr>
+        <w:t> staff st </w:t>
+      </w:r>
+      <w:r>
+        <w:rPr>
+          <w:rStyle w:val="cm-keyword"/>
+          <w:rFonts w:ascii="Courier New" w:hAnsi="Courier New" w:cs="Courier New"/>
+          <w:color w:val="770088"/>
+          <w:sz w:val="20"/>
+          <w:szCs w:val="20"/>
+          <w:shd w:val="clear" w:color="auto" w:fill="E5E5E5"/>
+        </w:rPr>
+        <w:t>ON</w:t>
+      </w:r>
+      <w:r>
+        <w:rPr>
+          <w:rFonts w:ascii="Courier New" w:hAnsi="Courier New" w:cs="Courier New"/>
+          <w:color w:val="444444"/>
+          <w:sz w:val="20"/>
+          <w:szCs w:val="20"/>
+          <w:shd w:val="clear" w:color="auto" w:fill="E5E5E5"/>
+        </w:rPr>
+        <w:t> s</w:t>
+      </w:r>
+      <w:r>
+        <w:rPr>
+          <w:rStyle w:val="cm-variable-2"/>
+          <w:rFonts w:ascii="Courier New" w:hAnsi="Courier New" w:cs="Courier New"/>
+          <w:color w:val="0055AA"/>
+          <w:sz w:val="20"/>
+          <w:szCs w:val="20"/>
+          <w:shd w:val="clear" w:color="auto" w:fill="E5E5E5"/>
+        </w:rPr>
+        <w:t>.store_id</w:t>
+      </w:r>
+      <w:r>
+        <w:rPr>
+          <w:rFonts w:ascii="Courier New" w:hAnsi="Courier New" w:cs="Courier New"/>
+          <w:color w:val="444444"/>
+          <w:sz w:val="20"/>
+          <w:szCs w:val="20"/>
+          <w:shd w:val="clear" w:color="auto" w:fill="E5E5E5"/>
+        </w:rPr>
+        <w:t> </w:t>
+      </w:r>
+      <w:r>
+        <w:rPr>
+          <w:rStyle w:val="cm-operator"/>
+          <w:rFonts w:ascii="Courier New" w:hAnsi="Courier New" w:cs="Courier New"/>
+          <w:color w:val="FF00FF"/>
+          <w:sz w:val="20"/>
+          <w:szCs w:val="20"/>
+          <w:shd w:val="clear" w:color="auto" w:fill="E5E5E5"/>
+        </w:rPr>
+        <w:t>=</w:t>
+      </w:r>
+      <w:r>
+        <w:rPr>
+          <w:rFonts w:ascii="Courier New" w:hAnsi="Courier New" w:cs="Courier New"/>
+          <w:color w:val="444444"/>
+          <w:sz w:val="20"/>
+          <w:szCs w:val="20"/>
+          <w:shd w:val="clear" w:color="auto" w:fill="E5E5E5"/>
+        </w:rPr>
+        <w:t> st</w:t>
+      </w:r>
+      <w:r>
+        <w:rPr>
+          <w:rStyle w:val="cm-variable-2"/>
+          <w:rFonts w:ascii="Courier New" w:hAnsi="Courier New" w:cs="Courier New"/>
+          <w:color w:val="0055AA"/>
+          <w:sz w:val="20"/>
+          <w:szCs w:val="20"/>
+          <w:shd w:val="clear" w:color="auto" w:fill="E5E5E5"/>
+        </w:rPr>
+        <w:t>.store_id</w:t>
+      </w:r>
+      <w:r>
+        <w:rPr>
+          <w:rFonts w:ascii="Courier New" w:hAnsi="Courier New" w:cs="Courier New"/>
+          <w:color w:val="444444"/>
+          <w:sz w:val="20"/>
+          <w:szCs w:val="20"/>
+          <w:shd w:val="clear" w:color="auto" w:fill="E5E5E5"/>
+        </w:rPr>
+        <w:t> </w:t>
+      </w:r>
+      <w:r>
+        <w:rPr>
+          <w:rStyle w:val="cm-keyword"/>
+          <w:rFonts w:ascii="Courier New" w:hAnsi="Courier New" w:cs="Courier New"/>
+          <w:color w:val="770088"/>
+          <w:sz w:val="20"/>
+          <w:szCs w:val="20"/>
+          <w:shd w:val="clear" w:color="auto" w:fill="E5E5E5"/>
+        </w:rPr>
+        <w:t>INNER</w:t>
+      </w:r>
+      <w:r>
+        <w:rPr>
+          <w:rFonts w:ascii="Courier New" w:hAnsi="Courier New" w:cs="Courier New"/>
+          <w:color w:val="444444"/>
+          <w:sz w:val="20"/>
+          <w:szCs w:val="20"/>
+          <w:shd w:val="clear" w:color="auto" w:fill="E5E5E5"/>
+        </w:rPr>
+        <w:t> </w:t>
+      </w:r>
+      <w:r>
+        <w:rPr>
+          <w:rStyle w:val="cm-keyword"/>
+          <w:rFonts w:ascii="Courier New" w:hAnsi="Courier New" w:cs="Courier New"/>
+          <w:color w:val="770088"/>
+          <w:sz w:val="20"/>
+          <w:szCs w:val="20"/>
+          <w:shd w:val="clear" w:color="auto" w:fill="E5E5E5"/>
+        </w:rPr>
+        <w:t>JOIN</w:t>
+      </w:r>
+      <w:r>
+        <w:rPr>
+          <w:rFonts w:ascii="Courier New" w:hAnsi="Courier New" w:cs="Courier New"/>
+          <w:color w:val="444444"/>
+          <w:sz w:val="20"/>
+          <w:szCs w:val="20"/>
+          <w:shd w:val="clear" w:color="auto" w:fill="E5E5E5"/>
+        </w:rPr>
+        <w:t> rental r </w:t>
+      </w:r>
+      <w:r>
+        <w:rPr>
+          <w:rStyle w:val="cm-keyword"/>
+          <w:rFonts w:ascii="Courier New" w:hAnsi="Courier New" w:cs="Courier New"/>
+          <w:color w:val="770088"/>
+          <w:sz w:val="20"/>
+          <w:szCs w:val="20"/>
+          <w:shd w:val="clear" w:color="auto" w:fill="E5E5E5"/>
+        </w:rPr>
+        <w:t>ON</w:t>
+      </w:r>
+      <w:r>
+        <w:rPr>
+          <w:rFonts w:ascii="Courier New" w:hAnsi="Courier New" w:cs="Courier New"/>
+          <w:color w:val="444444"/>
+          <w:sz w:val="20"/>
+          <w:szCs w:val="20"/>
+          <w:shd w:val="clear" w:color="auto" w:fill="E5E5E5"/>
+        </w:rPr>
+        <w:t> st</w:t>
+      </w:r>
+      <w:r>
+        <w:rPr>
+          <w:rStyle w:val="cm-variable-2"/>
+          <w:rFonts w:ascii="Courier New" w:hAnsi="Courier New" w:cs="Courier New"/>
+          <w:color w:val="0055AA"/>
+          <w:sz w:val="20"/>
+          <w:szCs w:val="20"/>
+          <w:shd w:val="clear" w:color="auto" w:fill="E5E5E5"/>
+        </w:rPr>
+        <w:t>.staff_id</w:t>
+      </w:r>
+      <w:r>
+        <w:rPr>
+          <w:rFonts w:ascii="Courier New" w:hAnsi="Courier New" w:cs="Courier New"/>
+          <w:color w:val="444444"/>
+          <w:sz w:val="20"/>
+          <w:szCs w:val="20"/>
+          <w:shd w:val="clear" w:color="auto" w:fill="E5E5E5"/>
+        </w:rPr>
+        <w:t> </w:t>
+      </w:r>
+      <w:r>
+        <w:rPr>
+          <w:rStyle w:val="cm-operator"/>
+          <w:rFonts w:ascii="Courier New" w:hAnsi="Courier New" w:cs="Courier New"/>
+          <w:color w:val="FF00FF"/>
+          <w:sz w:val="20"/>
+          <w:szCs w:val="20"/>
+          <w:shd w:val="clear" w:color="auto" w:fill="E5E5E5"/>
+        </w:rPr>
+        <w:t>=</w:t>
+      </w:r>
+      <w:r>
+        <w:rPr>
+          <w:rFonts w:ascii="Courier New" w:hAnsi="Courier New" w:cs="Courier New"/>
+          <w:color w:val="444444"/>
+          <w:sz w:val="20"/>
+          <w:szCs w:val="20"/>
+          <w:shd w:val="clear" w:color="auto" w:fill="E5E5E5"/>
+        </w:rPr>
+        <w:t> r</w:t>
+      </w:r>
+      <w:r>
+        <w:rPr>
+          <w:rStyle w:val="cm-variable-2"/>
+          <w:rFonts w:ascii="Courier New" w:hAnsi="Courier New" w:cs="Courier New"/>
+          <w:color w:val="0055AA"/>
+          <w:sz w:val="20"/>
+          <w:szCs w:val="20"/>
+          <w:shd w:val="clear" w:color="auto" w:fill="E5E5E5"/>
+        </w:rPr>
+        <w:t>.staff_id</w:t>
+      </w:r>
+      <w:r>
+        <w:rPr>
+          <w:rFonts w:ascii="Courier New" w:hAnsi="Courier New" w:cs="Courier New"/>
+          <w:color w:val="444444"/>
+          <w:sz w:val="20"/>
+          <w:szCs w:val="20"/>
+          <w:shd w:val="clear" w:color="auto" w:fill="E5E5E5"/>
+        </w:rPr>
+        <w:t> </w:t>
+      </w:r>
+      <w:r>
+        <w:rPr>
+          <w:rStyle w:val="cm-keyword"/>
+          <w:rFonts w:ascii="Courier New" w:hAnsi="Courier New" w:cs="Courier New"/>
+          <w:color w:val="770088"/>
+          <w:sz w:val="20"/>
+          <w:szCs w:val="20"/>
+          <w:shd w:val="clear" w:color="auto" w:fill="E5E5E5"/>
+        </w:rPr>
+        <w:t>GROUP</w:t>
+      </w:r>
+      <w:r>
+        <w:rPr>
+          <w:rFonts w:ascii="Courier New" w:hAnsi="Courier New" w:cs="Courier New"/>
+          <w:color w:val="444444"/>
+          <w:sz w:val="20"/>
+          <w:szCs w:val="20"/>
+          <w:shd w:val="clear" w:color="auto" w:fill="E5E5E5"/>
+        </w:rPr>
+        <w:t> </w:t>
+      </w:r>
+      <w:r>
+        <w:rPr>
+          <w:rStyle w:val="cm-keyword"/>
+          <w:rFonts w:ascii="Courier New" w:hAnsi="Courier New" w:cs="Courier New"/>
+          <w:color w:val="770088"/>
+          <w:sz w:val="20"/>
+          <w:szCs w:val="20"/>
+          <w:shd w:val="clear" w:color="auto" w:fill="E5E5E5"/>
+        </w:rPr>
+        <w:t>BY</w:t>
+      </w:r>
+      <w:r>
+        <w:rPr>
+          <w:rFonts w:ascii="Courier New" w:hAnsi="Courier New" w:cs="Courier New"/>
+          <w:color w:val="444444"/>
+          <w:sz w:val="20"/>
+          <w:szCs w:val="20"/>
+          <w:shd w:val="clear" w:color="auto" w:fill="E5E5E5"/>
+        </w:rPr>
+        <w:t> s</w:t>
+      </w:r>
+      <w:r>
+        <w:rPr>
+          <w:rStyle w:val="cm-variable-2"/>
+          <w:rFonts w:ascii="Courier New" w:hAnsi="Courier New" w:cs="Courier New"/>
+          <w:color w:val="0055AA"/>
+          <w:sz w:val="20"/>
+          <w:szCs w:val="20"/>
+          <w:shd w:val="clear" w:color="auto" w:fill="E5E5E5"/>
+        </w:rPr>
+        <w:t>.store_id</w:t>
+      </w:r>
+      <w:r>
+        <w:rPr>
+          <w:rStyle w:val="cm-punctuation"/>
+          <w:rFonts w:ascii="Courier New" w:hAnsi="Courier New" w:cs="Courier New"/>
+          <w:color w:val="444444"/>
+          <w:sz w:val="20"/>
+          <w:szCs w:val="20"/>
+          <w:shd w:val="clear" w:color="auto" w:fill="E5E5E5"/>
+        </w:rPr>
+        <w:t>;</w:t>
+      </w:r>
+      <w:bookmarkStart w:id="0" w:name="_GoBack"/>
+      <w:bookmarkEnd w:id="0"/>
+    </w:p>
+    <w:p>
+      <w:pPr>
+        <w:pStyle w:val="Prrafodelista"/>
+        <w:ind w:left="1080"/>
+        <w:rPr>
+          <w:b/>
+        </w:rPr>
+      </w:pPr>
+      <w:r>
+        <w:rPr>
+          <w:b/>
+        </w:rPr>
+        <w:drawing>
+          <wp:inline distT="0" distB="0" distL="0" distR="0" wp14:anchorId="19C71E62" wp14:editId="79D51392">
+            <wp:extent cx="5612130" cy="1131570"/>
+            <wp:effectExtent l="0" t="0" r="7620" b="0"/>
+            <wp:docPr id="10" name="Imagen 10"/>
+            <wp:cNvGraphicFramePr>
+              <a:graphicFrameLocks xmlns:a="http://schemas.openxmlformats.org/drawingml/2006/main" noChangeAspect="1"/>
+            </wp:cNvGraphicFramePr>
+            <a:graphic xmlns:a="http://schemas.openxmlformats.org/drawingml/2006/main">
+              <a:graphicData uri="http://schemas.openxmlformats.org/drawingml/2006/picture">
+                <pic:pic xmlns:pic="http://schemas.openxmlformats.org/drawingml/2006/picture">
+                  <pic:nvPicPr>
+                    <pic:cNvPr id="1" name=""/>
+                    <pic:cNvPicPr/>
+                  </pic:nvPicPr>
+                  <pic:blipFill>
+                    <a:blip r:embed="rId19"/>
+                    <a:stretch>
+                      <a:fillRect/>
+                    </a:stretch>
+                  </pic:blipFill>
+                  <pic:spPr>
+                    <a:xfrm>
+                      <a:off x="0" y="0"/>
+                      <a:ext cx="5612130" cy="1131570"/>
+                    </a:xfrm>
+                    <a:prstGeom prst="rect">
+                      <a:avLst/>
+                    </a:prstGeom>
+                  </pic:spPr>
+                </pic:pic>
+              </a:graphicData>
+            </a:graphic>
+          </wp:inline>
+        </w:drawing>
       </w:r>
     </w:p>
     <w:sectPr>
@@ -788,8 +2219,100 @@
       </w:pPr>
     </w:lvl>
   </w:abstractNum>
+  <w:abstractNum w:abstractNumId="1" w15:restartNumberingAfterBreak="0">
+    <w:nsid w:val="390369F2"/>
+    <w:multiLevelType w:val="hybridMultilevel"/>
+    <w:tmpl w:val="3F0E8DD4"/>
+    <w:lvl w:ilvl="0" w:tplc="03E23630">
+      <w:start w:val="9"/>
+      <w:numFmt w:val="decimal"/>
+      <w:lvlText w:val="%1"/>
+      <w:lvlJc w:val="left"/>
+      <w:pPr>
+        <w:ind w:left="1080" w:hanging="360"/>
+      </w:pPr>
+      <w:rPr>
+        <w:rFonts w:hint="default"/>
+      </w:rPr>
+    </w:lvl>
+    <w:lvl w:ilvl="1" w:tplc="080A0019" w:tentative="1">
+      <w:start w:val="1"/>
+      <w:numFmt w:val="lowerLetter"/>
+      <w:lvlText w:val="%2."/>
+      <w:lvlJc w:val="left"/>
+      <w:pPr>
+        <w:ind w:left="1800" w:hanging="360"/>
+      </w:pPr>
+    </w:lvl>
+    <w:lvl w:ilvl="2" w:tplc="080A001B" w:tentative="1">
+      <w:start w:val="1"/>
+      <w:numFmt w:val="lowerRoman"/>
+      <w:lvlText w:val="%3."/>
+      <w:lvlJc w:val="right"/>
+      <w:pPr>
+        <w:ind w:left="2520" w:hanging="180"/>
+      </w:pPr>
+    </w:lvl>
+    <w:lvl w:ilvl="3" w:tplc="080A000F" w:tentative="1">
+      <w:start w:val="1"/>
+      <w:numFmt w:val="decimal"/>
+      <w:lvlText w:val="%4."/>
+      <w:lvlJc w:val="left"/>
+      <w:pPr>
+        <w:ind w:left="3240" w:hanging="360"/>
+      </w:pPr>
+    </w:lvl>
+    <w:lvl w:ilvl="4" w:tplc="080A0019" w:tentative="1">
+      <w:start w:val="1"/>
+      <w:numFmt w:val="lowerLetter"/>
+      <w:lvlText w:val="%5."/>
+      <w:lvlJc w:val="left"/>
+      <w:pPr>
+        <w:ind w:left="3960" w:hanging="360"/>
+      </w:pPr>
+    </w:lvl>
+    <w:lvl w:ilvl="5" w:tplc="080A001B" w:tentative="1">
+      <w:start w:val="1"/>
+      <w:numFmt w:val="lowerRoman"/>
+      <w:lvlText w:val="%6."/>
+      <w:lvlJc w:val="right"/>
+      <w:pPr>
+        <w:ind w:left="4680" w:hanging="180"/>
+      </w:pPr>
+    </w:lvl>
+    <w:lvl w:ilvl="6" w:tplc="080A000F" w:tentative="1">
+      <w:start w:val="1"/>
+      <w:numFmt w:val="decimal"/>
+      <w:lvlText w:val="%7."/>
+      <w:lvlJc w:val="left"/>
+      <w:pPr>
+        <w:ind w:left="5400" w:hanging="360"/>
+      </w:pPr>
+    </w:lvl>
+    <w:lvl w:ilvl="7" w:tplc="080A0019" w:tentative="1">
+      <w:start w:val="1"/>
+      <w:numFmt w:val="lowerLetter"/>
+      <w:lvlText w:val="%8."/>
+      <w:lvlJc w:val="left"/>
+      <w:pPr>
+        <w:ind w:left="6120" w:hanging="360"/>
+      </w:pPr>
+    </w:lvl>
+    <w:lvl w:ilvl="8" w:tplc="080A001B" w:tentative="1">
+      <w:start w:val="1"/>
+      <w:numFmt w:val="lowerRoman"/>
+      <w:lvlText w:val="%9."/>
+      <w:lvlJc w:val="right"/>
+      <w:pPr>
+        <w:ind w:left="6840" w:hanging="180"/>
+      </w:pPr>
+    </w:lvl>
+  </w:abstractNum>
   <w:num w:numId="1">
     <w:abstractNumId w:val="0"/>
+  </w:num>
+  <w:num w:numId="2">
+    <w:abstractNumId w:val="1"/>
   </w:num>
 </w:numbering>
 </file>
@@ -1226,6 +2749,43 @@
       <w:contextualSpacing/>
     </w:pPr>
   </w:style>
+  <w:style w:type="character" w:customStyle="1" w:styleId="cm-keyword">
+    <w:name w:val="cm-keyword"/>
+    <w:basedOn w:val="Fuentedeprrafopredeter"/>
+    <w:rsid w:val="00F54BF9"/>
+  </w:style>
+  <w:style w:type="character" w:styleId="Hipervnculo">
+    <w:name w:val="Hyperlink"/>
+    <w:basedOn w:val="Fuentedeprrafopredeter"/>
+    <w:uiPriority w:val="99"/>
+    <w:semiHidden/>
+    <w:unhideWhenUsed/>
+    <w:rsid w:val="00F54BF9"/>
+    <w:rPr>
+      <w:color w:val="0000FF"/>
+      <w:u w:val="single"/>
+    </w:rPr>
+  </w:style>
+  <w:style w:type="character" w:customStyle="1" w:styleId="cm-variable-2">
+    <w:name w:val="cm-variable-2"/>
+    <w:basedOn w:val="Fuentedeprrafopredeter"/>
+    <w:rsid w:val="00F54BF9"/>
+  </w:style>
+  <w:style w:type="character" w:customStyle="1" w:styleId="cm-punctuation">
+    <w:name w:val="cm-punctuation"/>
+    <w:basedOn w:val="Fuentedeprrafopredeter"/>
+    <w:rsid w:val="00F54BF9"/>
+  </w:style>
+  <w:style w:type="character" w:customStyle="1" w:styleId="cm-bracket">
+    <w:name w:val="cm-bracket"/>
+    <w:basedOn w:val="Fuentedeprrafopredeter"/>
+    <w:rsid w:val="00F54BF9"/>
+  </w:style>
+  <w:style w:type="character" w:customStyle="1" w:styleId="cm-operator">
+    <w:name w:val="cm-operator"/>
+    <w:basedOn w:val="Fuentedeprrafopredeter"/>
+    <w:rsid w:val="00F61DBB"/>
+  </w:style>
 </w:styles>
 </file>
 
@@ -1488,4 +3048,16 @@
     </a:ext>
   </a:extLst>
 </a:theme>
+</file>
+
+<file path=customXml/item1.xml><?xml version="1.0" encoding="utf-8"?>
+<b:Sources xmlns:b="http://schemas.openxmlformats.org/officeDocument/2006/bibliography" xmlns="http://schemas.openxmlformats.org/officeDocument/2006/bibliography" SelectedStyle="\APASixthEditionOfficeOnline.xsl" StyleName="APA" Version="6"/>
+</file>
+
+<file path=customXml/itemProps1.xml><?xml version="1.0" encoding="utf-8"?>
+<ds:datastoreItem xmlns:ds="http://schemas.openxmlformats.org/officeDocument/2006/customXml" ds:itemID="{6035AE99-9663-4274-9836-D2E69A2F6AC6}">
+  <ds:schemaRefs>
+    <ds:schemaRef ds:uri="http://schemas.openxmlformats.org/officeDocument/2006/bibliography"/>
+  </ds:schemaRefs>
+</ds:datastoreItem>
 </file>
</xml_diff>